<commit_message>
Add simplified skill database
</commit_message>
<xml_diff>
--- a/전투 시스템 및 스킬 목록.docx
+++ b/전투 시스템 및 스킬 목록.docx
@@ -58,6 +58,9 @@
     </w:p>
     <w:p>
       <w:r>
+        <w:rPr>
+          <w:noProof/>
+        </w:rPr>
         <w:drawing>
           <wp:inline distT="0" distB="0" distL="0" distR="0" wp14:anchorId="1C996468" wp14:editId="6BD4D369">
             <wp:extent cx="5731510" cy="1518285"/>
@@ -139,7 +142,888 @@
         </w:rPr>
         <w:t>캐릭터가 가진 스킬은 패시브 액티브로 분류되며 사용 가능한 스킬의 수에는 기본적으로 제한이 없다</w:t>
       </w:r>
+      <w:r>
+        <w:rPr>
+          <w:rFonts w:hint="eastAsia"/>
+        </w:rPr>
+        <w:t>(단 스킬 별로 요구하는 조건을 만족하지 못하면 사용불가)</w:t>
+      </w:r>
     </w:p>
+    <w:p>
+      <w:r>
+        <w:rPr>
+          <w:rFonts w:hint="eastAsia"/>
+        </w:rPr>
+        <w:t>예를 들어 투사의 스킬인 돌진 배기는 장비 조건으로 근접 무기를 요구해 없으면 쓸 수 없다</w:t>
+      </w:r>
+    </w:p>
+    <w:p/>
+    <w:p/>
+    <w:p/>
+    <w:p/>
+    <w:p/>
+    <w:p/>
+    <w:p>
+      <w:pPr>
+        <w:rPr>
+          <w:rFonts w:hint="eastAsia"/>
+        </w:rPr>
+      </w:pPr>
+    </w:p>
+    <w:p>
+      <w:r>
+        <w:rPr>
+          <w:rFonts w:hint="eastAsia"/>
+        </w:rPr>
+        <w:lastRenderedPageBreak/>
+        <w:t>초기 직업 별 스킬 목록</w:t>
+      </w:r>
+    </w:p>
+    <w:p/>
+    <w:p>
+      <w:r>
+        <w:rPr>
+          <w:rFonts w:hint="eastAsia"/>
+        </w:rPr>
+        <w:t>투사</w:t>
+      </w:r>
+    </w:p>
+    <w:tbl>
+      <w:tblPr>
+        <w:tblStyle w:val="aa"/>
+        <w:tblW w:w="0" w:type="auto"/>
+        <w:tblLook w:val="04A0" w:firstRow="1" w:lastRow="0" w:firstColumn="1" w:lastColumn="0" w:noHBand="0" w:noVBand="1"/>
+      </w:tblPr>
+      <w:tblGrid>
+        <w:gridCol w:w="704"/>
+        <w:gridCol w:w="1134"/>
+        <w:gridCol w:w="1276"/>
+        <w:gridCol w:w="1276"/>
+        <w:gridCol w:w="4626"/>
+      </w:tblGrid>
+      <w:tr>
+        <w:tc>
+          <w:tcPr>
+            <w:tcW w:w="704" w:type="dxa"/>
+          </w:tcPr>
+          <w:p>
+            <w:pPr>
+              <w:rPr>
+                <w:rFonts w:hint="eastAsia"/>
+              </w:rPr>
+            </w:pPr>
+            <w:r>
+              <w:rPr>
+                <w:rFonts w:hint="eastAsia"/>
+              </w:rPr>
+              <w:t>레벨</w:t>
+            </w:r>
+          </w:p>
+        </w:tc>
+        <w:tc>
+          <w:tcPr>
+            <w:tcW w:w="1134" w:type="dxa"/>
+          </w:tcPr>
+          <w:p>
+            <w:pPr>
+              <w:rPr>
+                <w:rFonts w:hint="eastAsia"/>
+              </w:rPr>
+            </w:pPr>
+            <w:proofErr w:type="spellStart"/>
+            <w:r>
+              <w:rPr>
+                <w:rFonts w:hint="eastAsia"/>
+              </w:rPr>
+              <w:t>스킬유형</w:t>
+            </w:r>
+            <w:proofErr w:type="spellEnd"/>
+          </w:p>
+        </w:tc>
+        <w:tc>
+          <w:tcPr>
+            <w:tcW w:w="1276" w:type="dxa"/>
+          </w:tcPr>
+          <w:p>
+            <w:pPr>
+              <w:rPr>
+                <w:rFonts w:hint="eastAsia"/>
+              </w:rPr>
+            </w:pPr>
+            <w:r>
+              <w:rPr>
+                <w:rFonts w:hint="eastAsia"/>
+              </w:rPr>
+              <w:t>조건</w:t>
+            </w:r>
+          </w:p>
+        </w:tc>
+        <w:tc>
+          <w:tcPr>
+            <w:tcW w:w="1276" w:type="dxa"/>
+          </w:tcPr>
+          <w:p>
+            <w:pPr>
+              <w:rPr>
+                <w:rFonts w:hint="eastAsia"/>
+              </w:rPr>
+            </w:pPr>
+            <w:r>
+              <w:rPr>
+                <w:rFonts w:hint="eastAsia"/>
+              </w:rPr>
+              <w:t>이름</w:t>
+            </w:r>
+          </w:p>
+        </w:tc>
+        <w:tc>
+          <w:tcPr>
+            <w:tcW w:w="4626" w:type="dxa"/>
+          </w:tcPr>
+          <w:p>
+            <w:pPr>
+              <w:rPr>
+                <w:rFonts w:hint="eastAsia"/>
+              </w:rPr>
+            </w:pPr>
+            <w:r>
+              <w:rPr>
+                <w:rFonts w:hint="eastAsia"/>
+              </w:rPr>
+              <w:t>효과</w:t>
+            </w:r>
+          </w:p>
+        </w:tc>
+      </w:tr>
+      <w:tr>
+        <w:tc>
+          <w:tcPr>
+            <w:tcW w:w="704" w:type="dxa"/>
+          </w:tcPr>
+          <w:p>
+            <w:pPr>
+              <w:rPr>
+                <w:rFonts w:hint="eastAsia"/>
+              </w:rPr>
+            </w:pPr>
+            <w:r>
+              <w:rPr>
+                <w:rFonts w:hint="eastAsia"/>
+              </w:rPr>
+              <w:t>1</w:t>
+            </w:r>
+          </w:p>
+        </w:tc>
+        <w:tc>
+          <w:tcPr>
+            <w:tcW w:w="1134" w:type="dxa"/>
+          </w:tcPr>
+          <w:p>
+            <w:pPr>
+              <w:rPr>
+                <w:rFonts w:hint="eastAsia"/>
+              </w:rPr>
+            </w:pPr>
+            <w:r>
+              <w:rPr>
+                <w:rFonts w:hint="eastAsia"/>
+              </w:rPr>
+              <w:t>액티브</w:t>
+            </w:r>
+          </w:p>
+        </w:tc>
+        <w:tc>
+          <w:tcPr>
+            <w:tcW w:w="1276" w:type="dxa"/>
+          </w:tcPr>
+          <w:p>
+            <w:pPr>
+              <w:rPr>
+                <w:rFonts w:hint="eastAsia"/>
+              </w:rPr>
+            </w:pPr>
+            <w:r>
+              <w:rPr>
+                <w:rFonts w:hint="eastAsia"/>
+              </w:rPr>
+              <w:t>근접무기</w:t>
+            </w:r>
+          </w:p>
+        </w:tc>
+        <w:tc>
+          <w:tcPr>
+            <w:tcW w:w="1276" w:type="dxa"/>
+          </w:tcPr>
+          <w:p>
+            <w:pPr>
+              <w:rPr>
+                <w:rFonts w:hint="eastAsia"/>
+              </w:rPr>
+            </w:pPr>
+            <w:r>
+              <w:rPr>
+                <w:rFonts w:hint="eastAsia"/>
+              </w:rPr>
+              <w:t>돌진</w:t>
+            </w:r>
+          </w:p>
+        </w:tc>
+        <w:tc>
+          <w:tcPr>
+            <w:tcW w:w="4626" w:type="dxa"/>
+          </w:tcPr>
+          <w:p>
+            <w:pPr>
+              <w:rPr>
+                <w:rFonts w:hint="eastAsia"/>
+              </w:rPr>
+            </w:pPr>
+            <w:r>
+              <w:rPr>
+                <w:rFonts w:hint="eastAsia"/>
+              </w:rPr>
+              <w:t xml:space="preserve">(234열에서 사용 가능)앞으로 2열 전진하면서 같은 행의 1열을 공격한다. </w:t>
+            </w:r>
+          </w:p>
+        </w:tc>
+      </w:tr>
+      <w:tr>
+        <w:tc>
+          <w:tcPr>
+            <w:tcW w:w="704" w:type="dxa"/>
+          </w:tcPr>
+          <w:p>
+            <w:pPr>
+              <w:rPr>
+                <w:rFonts w:hint="eastAsia"/>
+              </w:rPr>
+            </w:pPr>
+            <w:r>
+              <w:rPr>
+                <w:rFonts w:hint="eastAsia"/>
+              </w:rPr>
+              <w:t>2</w:t>
+            </w:r>
+          </w:p>
+        </w:tc>
+        <w:tc>
+          <w:tcPr>
+            <w:tcW w:w="1134" w:type="dxa"/>
+          </w:tcPr>
+          <w:p>
+            <w:pPr>
+              <w:rPr>
+                <w:rFonts w:hint="eastAsia"/>
+              </w:rPr>
+            </w:pPr>
+            <w:r>
+              <w:rPr>
+                <w:rFonts w:hint="eastAsia"/>
+              </w:rPr>
+              <w:t>패시브</w:t>
+            </w:r>
+          </w:p>
+        </w:tc>
+        <w:tc>
+          <w:tcPr>
+            <w:tcW w:w="1276" w:type="dxa"/>
+          </w:tcPr>
+          <w:p>
+            <w:pPr>
+              <w:rPr>
+                <w:rFonts w:hint="eastAsia"/>
+              </w:rPr>
+            </w:pPr>
+            <w:r>
+              <w:rPr>
+                <w:rFonts w:hint="eastAsia"/>
+              </w:rPr>
+              <w:t>없음</w:t>
+            </w:r>
+          </w:p>
+        </w:tc>
+        <w:tc>
+          <w:tcPr>
+            <w:tcW w:w="1276" w:type="dxa"/>
+          </w:tcPr>
+          <w:p>
+            <w:pPr>
+              <w:rPr>
+                <w:rFonts w:hint="eastAsia"/>
+              </w:rPr>
+            </w:pPr>
+            <w:r>
+              <w:rPr>
+                <w:rFonts w:hint="eastAsia"/>
+              </w:rPr>
+              <w:t>내구력</w:t>
+            </w:r>
+          </w:p>
+        </w:tc>
+        <w:tc>
+          <w:tcPr>
+            <w:tcW w:w="4626" w:type="dxa"/>
+          </w:tcPr>
+          <w:p>
+            <w:pPr>
+              <w:rPr>
+                <w:rFonts w:hint="eastAsia"/>
+              </w:rPr>
+            </w:pPr>
+            <w:r>
+              <w:rPr>
+                <w:rFonts w:hint="eastAsia"/>
+              </w:rPr>
+              <w:t>받는 피해가 10% 감소한다</w:t>
+            </w:r>
+          </w:p>
+        </w:tc>
+      </w:tr>
+      <w:tr>
+        <w:tc>
+          <w:tcPr>
+            <w:tcW w:w="704" w:type="dxa"/>
+          </w:tcPr>
+          <w:p>
+            <w:pPr>
+              <w:rPr>
+                <w:rFonts w:hint="eastAsia"/>
+              </w:rPr>
+            </w:pPr>
+            <w:r>
+              <w:rPr>
+                <w:rFonts w:hint="eastAsia"/>
+              </w:rPr>
+              <w:t>3</w:t>
+            </w:r>
+          </w:p>
+        </w:tc>
+        <w:tc>
+          <w:tcPr>
+            <w:tcW w:w="1134" w:type="dxa"/>
+          </w:tcPr>
+          <w:p>
+            <w:pPr>
+              <w:rPr>
+                <w:rFonts w:hint="eastAsia"/>
+              </w:rPr>
+            </w:pPr>
+          </w:p>
+        </w:tc>
+        <w:tc>
+          <w:tcPr>
+            <w:tcW w:w="1276" w:type="dxa"/>
+          </w:tcPr>
+          <w:p>
+            <w:pPr>
+              <w:rPr>
+                <w:rFonts w:hint="eastAsia"/>
+              </w:rPr>
+            </w:pPr>
+          </w:p>
+        </w:tc>
+        <w:tc>
+          <w:tcPr>
+            <w:tcW w:w="1276" w:type="dxa"/>
+          </w:tcPr>
+          <w:p>
+            <w:pPr>
+              <w:rPr>
+                <w:rFonts w:hint="eastAsia"/>
+              </w:rPr>
+            </w:pPr>
+          </w:p>
+        </w:tc>
+        <w:tc>
+          <w:tcPr>
+            <w:tcW w:w="4626" w:type="dxa"/>
+          </w:tcPr>
+          <w:p>
+            <w:pPr>
+              <w:rPr>
+                <w:rFonts w:hint="eastAsia"/>
+              </w:rPr>
+            </w:pPr>
+          </w:p>
+        </w:tc>
+      </w:tr>
+      <w:tr>
+        <w:tc>
+          <w:tcPr>
+            <w:tcW w:w="704" w:type="dxa"/>
+          </w:tcPr>
+          <w:p>
+            <w:pPr>
+              <w:rPr>
+                <w:rFonts w:hint="eastAsia"/>
+              </w:rPr>
+            </w:pPr>
+            <w:r>
+              <w:rPr>
+                <w:rFonts w:hint="eastAsia"/>
+              </w:rPr>
+              <w:t>4</w:t>
+            </w:r>
+          </w:p>
+        </w:tc>
+        <w:tc>
+          <w:tcPr>
+            <w:tcW w:w="1134" w:type="dxa"/>
+          </w:tcPr>
+          <w:p>
+            <w:pPr>
+              <w:rPr>
+                <w:rFonts w:hint="eastAsia"/>
+              </w:rPr>
+            </w:pPr>
+          </w:p>
+        </w:tc>
+        <w:tc>
+          <w:tcPr>
+            <w:tcW w:w="1276" w:type="dxa"/>
+          </w:tcPr>
+          <w:p>
+            <w:pPr>
+              <w:rPr>
+                <w:rFonts w:hint="eastAsia"/>
+              </w:rPr>
+            </w:pPr>
+          </w:p>
+        </w:tc>
+        <w:tc>
+          <w:tcPr>
+            <w:tcW w:w="1276" w:type="dxa"/>
+          </w:tcPr>
+          <w:p>
+            <w:pPr>
+              <w:rPr>
+                <w:rFonts w:hint="eastAsia"/>
+              </w:rPr>
+            </w:pPr>
+          </w:p>
+        </w:tc>
+        <w:tc>
+          <w:tcPr>
+            <w:tcW w:w="4626" w:type="dxa"/>
+          </w:tcPr>
+          <w:p>
+            <w:pPr>
+              <w:rPr>
+                <w:rFonts w:hint="eastAsia"/>
+              </w:rPr>
+            </w:pPr>
+          </w:p>
+        </w:tc>
+      </w:tr>
+      <w:tr>
+        <w:tc>
+          <w:tcPr>
+            <w:tcW w:w="704" w:type="dxa"/>
+          </w:tcPr>
+          <w:p>
+            <w:pPr>
+              <w:rPr>
+                <w:rFonts w:hint="eastAsia"/>
+              </w:rPr>
+            </w:pPr>
+            <w:r>
+              <w:rPr>
+                <w:rFonts w:hint="eastAsia"/>
+              </w:rPr>
+              <w:t>5</w:t>
+            </w:r>
+          </w:p>
+        </w:tc>
+        <w:tc>
+          <w:tcPr>
+            <w:tcW w:w="1134" w:type="dxa"/>
+          </w:tcPr>
+          <w:p>
+            <w:pPr>
+              <w:rPr>
+                <w:rFonts w:hint="eastAsia"/>
+              </w:rPr>
+            </w:pPr>
+          </w:p>
+        </w:tc>
+        <w:tc>
+          <w:tcPr>
+            <w:tcW w:w="1276" w:type="dxa"/>
+          </w:tcPr>
+          <w:p>
+            <w:pPr>
+              <w:rPr>
+                <w:rFonts w:hint="eastAsia"/>
+              </w:rPr>
+            </w:pPr>
+          </w:p>
+        </w:tc>
+        <w:tc>
+          <w:tcPr>
+            <w:tcW w:w="1276" w:type="dxa"/>
+          </w:tcPr>
+          <w:p>
+            <w:pPr>
+              <w:rPr>
+                <w:rFonts w:hint="eastAsia"/>
+              </w:rPr>
+            </w:pPr>
+          </w:p>
+        </w:tc>
+        <w:tc>
+          <w:tcPr>
+            <w:tcW w:w="4626" w:type="dxa"/>
+          </w:tcPr>
+          <w:p>
+            <w:pPr>
+              <w:rPr>
+                <w:rFonts w:hint="eastAsia"/>
+              </w:rPr>
+            </w:pPr>
+          </w:p>
+        </w:tc>
+      </w:tr>
+      <w:tr>
+        <w:tc>
+          <w:tcPr>
+            <w:tcW w:w="704" w:type="dxa"/>
+          </w:tcPr>
+          <w:p>
+            <w:pPr>
+              <w:rPr>
+                <w:rFonts w:hint="eastAsia"/>
+              </w:rPr>
+            </w:pPr>
+            <w:r>
+              <w:rPr>
+                <w:rFonts w:hint="eastAsia"/>
+              </w:rPr>
+              <w:t>6</w:t>
+            </w:r>
+          </w:p>
+        </w:tc>
+        <w:tc>
+          <w:tcPr>
+            <w:tcW w:w="1134" w:type="dxa"/>
+          </w:tcPr>
+          <w:p>
+            <w:pPr>
+              <w:rPr>
+                <w:rFonts w:hint="eastAsia"/>
+              </w:rPr>
+            </w:pPr>
+          </w:p>
+        </w:tc>
+        <w:tc>
+          <w:tcPr>
+            <w:tcW w:w="1276" w:type="dxa"/>
+          </w:tcPr>
+          <w:p>
+            <w:pPr>
+              <w:rPr>
+                <w:rFonts w:hint="eastAsia"/>
+              </w:rPr>
+            </w:pPr>
+          </w:p>
+        </w:tc>
+        <w:tc>
+          <w:tcPr>
+            <w:tcW w:w="1276" w:type="dxa"/>
+          </w:tcPr>
+          <w:p>
+            <w:pPr>
+              <w:rPr>
+                <w:rFonts w:hint="eastAsia"/>
+              </w:rPr>
+            </w:pPr>
+          </w:p>
+        </w:tc>
+        <w:tc>
+          <w:tcPr>
+            <w:tcW w:w="4626" w:type="dxa"/>
+          </w:tcPr>
+          <w:p>
+            <w:pPr>
+              <w:rPr>
+                <w:rFonts w:hint="eastAsia"/>
+              </w:rPr>
+            </w:pPr>
+          </w:p>
+        </w:tc>
+      </w:tr>
+      <w:tr>
+        <w:tc>
+          <w:tcPr>
+            <w:tcW w:w="704" w:type="dxa"/>
+          </w:tcPr>
+          <w:p>
+            <w:pPr>
+              <w:rPr>
+                <w:rFonts w:hint="eastAsia"/>
+              </w:rPr>
+            </w:pPr>
+            <w:r>
+              <w:rPr>
+                <w:rFonts w:hint="eastAsia"/>
+              </w:rPr>
+              <w:t>7</w:t>
+            </w:r>
+          </w:p>
+        </w:tc>
+        <w:tc>
+          <w:tcPr>
+            <w:tcW w:w="1134" w:type="dxa"/>
+          </w:tcPr>
+          <w:p>
+            <w:pPr>
+              <w:rPr>
+                <w:rFonts w:hint="eastAsia"/>
+              </w:rPr>
+            </w:pPr>
+          </w:p>
+        </w:tc>
+        <w:tc>
+          <w:tcPr>
+            <w:tcW w:w="1276" w:type="dxa"/>
+          </w:tcPr>
+          <w:p>
+            <w:pPr>
+              <w:rPr>
+                <w:rFonts w:hint="eastAsia"/>
+              </w:rPr>
+            </w:pPr>
+          </w:p>
+        </w:tc>
+        <w:tc>
+          <w:tcPr>
+            <w:tcW w:w="1276" w:type="dxa"/>
+          </w:tcPr>
+          <w:p>
+            <w:pPr>
+              <w:rPr>
+                <w:rFonts w:hint="eastAsia"/>
+              </w:rPr>
+            </w:pPr>
+          </w:p>
+        </w:tc>
+        <w:tc>
+          <w:tcPr>
+            <w:tcW w:w="4626" w:type="dxa"/>
+          </w:tcPr>
+          <w:p>
+            <w:pPr>
+              <w:rPr>
+                <w:rFonts w:hint="eastAsia"/>
+              </w:rPr>
+            </w:pPr>
+          </w:p>
+        </w:tc>
+      </w:tr>
+      <w:tr>
+        <w:tc>
+          <w:tcPr>
+            <w:tcW w:w="704" w:type="dxa"/>
+          </w:tcPr>
+          <w:p>
+            <w:pPr>
+              <w:rPr>
+                <w:rFonts w:hint="eastAsia"/>
+              </w:rPr>
+            </w:pPr>
+            <w:r>
+              <w:rPr>
+                <w:rFonts w:hint="eastAsia"/>
+              </w:rPr>
+              <w:t>8</w:t>
+            </w:r>
+          </w:p>
+        </w:tc>
+        <w:tc>
+          <w:tcPr>
+            <w:tcW w:w="1134" w:type="dxa"/>
+          </w:tcPr>
+          <w:p>
+            <w:pPr>
+              <w:rPr>
+                <w:rFonts w:hint="eastAsia"/>
+              </w:rPr>
+            </w:pPr>
+          </w:p>
+        </w:tc>
+        <w:tc>
+          <w:tcPr>
+            <w:tcW w:w="1276" w:type="dxa"/>
+          </w:tcPr>
+          <w:p>
+            <w:pPr>
+              <w:rPr>
+                <w:rFonts w:hint="eastAsia"/>
+              </w:rPr>
+            </w:pPr>
+          </w:p>
+        </w:tc>
+        <w:tc>
+          <w:tcPr>
+            <w:tcW w:w="1276" w:type="dxa"/>
+          </w:tcPr>
+          <w:p>
+            <w:pPr>
+              <w:rPr>
+                <w:rFonts w:hint="eastAsia"/>
+              </w:rPr>
+            </w:pPr>
+          </w:p>
+        </w:tc>
+        <w:tc>
+          <w:tcPr>
+            <w:tcW w:w="4626" w:type="dxa"/>
+          </w:tcPr>
+          <w:p>
+            <w:pPr>
+              <w:rPr>
+                <w:rFonts w:hint="eastAsia"/>
+              </w:rPr>
+            </w:pPr>
+          </w:p>
+        </w:tc>
+      </w:tr>
+      <w:tr>
+        <w:tc>
+          <w:tcPr>
+            <w:tcW w:w="704" w:type="dxa"/>
+          </w:tcPr>
+          <w:p>
+            <w:pPr>
+              <w:rPr>
+                <w:rFonts w:hint="eastAsia"/>
+              </w:rPr>
+            </w:pPr>
+            <w:r>
+              <w:rPr>
+                <w:rFonts w:hint="eastAsia"/>
+              </w:rPr>
+              <w:t>9</w:t>
+            </w:r>
+          </w:p>
+        </w:tc>
+        <w:tc>
+          <w:tcPr>
+            <w:tcW w:w="1134" w:type="dxa"/>
+          </w:tcPr>
+          <w:p>
+            <w:pPr>
+              <w:rPr>
+                <w:rFonts w:hint="eastAsia"/>
+              </w:rPr>
+            </w:pPr>
+          </w:p>
+        </w:tc>
+        <w:tc>
+          <w:tcPr>
+            <w:tcW w:w="1276" w:type="dxa"/>
+          </w:tcPr>
+          <w:p>
+            <w:pPr>
+              <w:rPr>
+                <w:rFonts w:hint="eastAsia"/>
+              </w:rPr>
+            </w:pPr>
+          </w:p>
+        </w:tc>
+        <w:tc>
+          <w:tcPr>
+            <w:tcW w:w="1276" w:type="dxa"/>
+          </w:tcPr>
+          <w:p>
+            <w:pPr>
+              <w:rPr>
+                <w:rFonts w:hint="eastAsia"/>
+              </w:rPr>
+            </w:pPr>
+          </w:p>
+        </w:tc>
+        <w:tc>
+          <w:tcPr>
+            <w:tcW w:w="4626" w:type="dxa"/>
+          </w:tcPr>
+          <w:p>
+            <w:pPr>
+              <w:rPr>
+                <w:rFonts w:hint="eastAsia"/>
+              </w:rPr>
+            </w:pPr>
+          </w:p>
+        </w:tc>
+      </w:tr>
+      <w:tr>
+        <w:tc>
+          <w:tcPr>
+            <w:tcW w:w="704" w:type="dxa"/>
+          </w:tcPr>
+          <w:p>
+            <w:pPr>
+              <w:rPr>
+                <w:rFonts w:hint="eastAsia"/>
+              </w:rPr>
+            </w:pPr>
+            <w:r>
+              <w:rPr>
+                <w:rFonts w:hint="eastAsia"/>
+              </w:rPr>
+              <w:t>10</w:t>
+            </w:r>
+          </w:p>
+        </w:tc>
+        <w:tc>
+          <w:tcPr>
+            <w:tcW w:w="1134" w:type="dxa"/>
+          </w:tcPr>
+          <w:p>
+            <w:pPr>
+              <w:rPr>
+                <w:rFonts w:hint="eastAsia"/>
+              </w:rPr>
+            </w:pPr>
+          </w:p>
+        </w:tc>
+        <w:tc>
+          <w:tcPr>
+            <w:tcW w:w="1276" w:type="dxa"/>
+          </w:tcPr>
+          <w:p>
+            <w:pPr>
+              <w:rPr>
+                <w:rFonts w:hint="eastAsia"/>
+              </w:rPr>
+            </w:pPr>
+          </w:p>
+        </w:tc>
+        <w:tc>
+          <w:tcPr>
+            <w:tcW w:w="1276" w:type="dxa"/>
+          </w:tcPr>
+          <w:p>
+            <w:pPr>
+              <w:rPr>
+                <w:rFonts w:hint="eastAsia"/>
+              </w:rPr>
+            </w:pPr>
+          </w:p>
+        </w:tc>
+        <w:tc>
+          <w:tcPr>
+            <w:tcW w:w="4626" w:type="dxa"/>
+          </w:tcPr>
+          <w:p>
+            <w:pPr>
+              <w:rPr>
+                <w:rFonts w:hint="eastAsia"/>
+              </w:rPr>
+            </w:pPr>
+          </w:p>
+        </w:tc>
+      </w:tr>
+    </w:tbl>
     <w:p>
       <w:pPr>
         <w:rPr>
@@ -1073,6 +1957,25 @@
       <w:spacing w:val="5"/>
     </w:rPr>
   </w:style>
+  <w:style w:type="table" w:styleId="aa">
+    <w:name w:val="Table Grid"/>
+    <w:basedOn w:val="a1"/>
+    <w:uiPriority w:val="39"/>
+    <w:rsid w:val="00F472E8"/>
+    <w:pPr>
+      <w:spacing w:after="0"/>
+    </w:pPr>
+    <w:tblPr>
+      <w:tblBorders>
+        <w:top w:val="single" w:sz="4" w:space="0" w:color="auto"/>
+        <w:left w:val="single" w:sz="4" w:space="0" w:color="auto"/>
+        <w:bottom w:val="single" w:sz="4" w:space="0" w:color="auto"/>
+        <w:right w:val="single" w:sz="4" w:space="0" w:color="auto"/>
+        <w:insideH w:val="single" w:sz="4" w:space="0" w:color="auto"/>
+        <w:insideV w:val="single" w:sz="4" w:space="0" w:color="auto"/>
+      </w:tblBorders>
+    </w:tblPr>
+  </w:style>
 </w:styles>
 </file>
 

</xml_diff>